<commit_message>
files added from bro
</commit_message>
<xml_diff>
--- a/frontend/finder/alerted_documents/vessel_report_9481494.docx
+++ b/frontend/finder/alerted_documents/vessel_report_9481494.docx
@@ -117,17 +117,17 @@
     </w:p>
     <w:p>
       <w:r>
-        <w:t>ETA_AIS: 2025-01-31 13:51</w:t>
+        <w:t>ETA_AIS: 2025-02-01 23:09</w:t>
       </w:r>
     </w:p>
     <w:p>
       <w:r>
-        <w:t>ETA: 2025-01-31 13:51</w:t>
+        <w:t>ETA: 2025-02-01 23:09</w:t>
       </w:r>
     </w:p>
     <w:p>
       <w:r>
-        <w:t>ETA_PREDICTED: 2025-01-31 13:51</w:t>
+        <w:t>ETA_PREDICTED: 2025-02-01 23:09</w:t>
       </w:r>
     </w:p>
     <w:p>
@@ -152,7 +152,7 @@
     </w:p>
     <w:p>
       <w:r>
-        <w:t>TIMESTAMP: 2025-01-31T13:51:02.412037000</w:t>
+        <w:t>TIMESTAMP: 2025-02-01T23:09:58.659580000</w:t>
       </w:r>
     </w:p>
     <w:p>

</xml_diff>

<commit_message>
done bro fianlly no more commit :))
</commit_message>
<xml_diff>
--- a/frontend/finder/alerted_documents/vessel_report_9481494.docx
+++ b/frontend/finder/alerted_documents/vessel_report_9481494.docx
@@ -117,17 +117,17 @@
     </w:p>
     <w:p>
       <w:r>
-        <w:t>ETA_AIS: 2025-02-01 23:09</w:t>
+        <w:t>ETA_AIS: 2025-02-02 04:27</w:t>
       </w:r>
     </w:p>
     <w:p>
       <w:r>
-        <w:t>ETA: 2025-02-01 23:09</w:t>
+        <w:t>ETA: 2025-02-02 04:27</w:t>
       </w:r>
     </w:p>
     <w:p>
       <w:r>
-        <w:t>ETA_PREDICTED: 2025-02-01 23:09</w:t>
+        <w:t>ETA_PREDICTED: 2025-02-02 04:27</w:t>
       </w:r>
     </w:p>
     <w:p>
@@ -152,7 +152,7 @@
     </w:p>
     <w:p>
       <w:r>
-        <w:t>TIMESTAMP: 2025-02-01T23:09:58.659580000</w:t>
+        <w:t>TIMESTAMP: 2025-02-02T04:27:08.882007000</w:t>
       </w:r>
     </w:p>
     <w:p>

</xml_diff>